<commit_message>
fix: valid DOCX output and PDF layout fidelity
- Escape user text in DOCX templates (an '&' produced a corrupt document LibreOffice refused)
- ICT and Conclusion text use body style, not numbered heading style
- Indemnity fits one A4 page like the original
- PDF conversion test (skipped where LibreOffice is absent)

Co-Authored-By: Claude Opus 5.5 <noreply@anthropic.com>
</commit_message>
<xml_diff>
--- a/resources/templates/filled/06. Event Proposal Template 052026.docx
+++ b/resources/templates/filled/06. Event Proposal Template 052026.docx
@@ -4546,24 +4546,16 @@
     </w:p>
     <w:p>
       <w:pPr>
-        <w:numPr>
-          <w:ilvl w:val="0"/>
-          <w:numId w:val="1"/>
-        </w:numPr>
         <w:spacing w:after="0" w:line="480" w:lineRule="auto"/>
-        <w:ind w:left="567" w:hanging="567"/>
+        <w:ind w:left="567" w:firstLine="0"/>
         <w:jc w:val="both"/>
         <w:rPr>
           <w:rFonts w:ascii="Arial" w:cs="Arial" w:eastAsia="Arial" w:hAnsi="Arial"/>
-          <w:b w:val="1"/>
-          <w:bCs w:val="1"/>
         </w:rPr>
       </w:pPr>
       <w:r>
         <w:rPr>
           <w:rFonts w:ascii="Arial" w:cs="Arial" w:eastAsia="Arial" w:hAnsi="Arial"/>
-          <w:b w:val="1"/>
-          <w:bCs w:val="1"/>
           <w:rtl w:val="0"/>
         </w:rPr>
         <w:t xml:space="preserve">${ict_requirements}</w:t>
@@ -6250,24 +6242,16 @@
     </w:p>
     <w:p>
       <w:pPr>
-        <w:numPr>
-          <w:ilvl w:val="0"/>
-          <w:numId w:val="1"/>
-        </w:numPr>
         <w:spacing w:after="0" w:line="480" w:lineRule="auto"/>
-        <w:ind w:left="567" w:hanging="567"/>
+        <w:ind w:left="567" w:firstLine="0"/>
         <w:jc w:val="both"/>
         <w:rPr>
           <w:rFonts w:ascii="Arial" w:cs="Arial" w:eastAsia="Arial" w:hAnsi="Arial"/>
-          <w:b w:val="1"/>
-          <w:bCs w:val="1"/>
         </w:rPr>
       </w:pPr>
       <w:r>
         <w:rPr>
           <w:rFonts w:ascii="Arial" w:cs="Arial" w:eastAsia="Arial" w:hAnsi="Arial"/>
-          <w:b w:val="1"/>
-          <w:bCs w:val="1"/>
           <w:rtl w:val="0"/>
         </w:rPr>
         <w:t xml:space="preserve">${conclusion}</w:t>

</xml_diff>